<commit_message>
Fase 3: (RN) completar validaciones de citas y disponibilidad
</commit_message>
<xml_diff>
--- a/FASE 3 - IMPLEMENTACION DE BASE DE DATOS Y BACKEND/CAPÍTULO 4 - CONEXIÓN PHP → MYSQL/Capitulo 4 - Conexion PHP → MYSQL.docx
+++ b/FASE 3 - IMPLEMENTACION DE BASE DE DATOS Y BACKEND/CAPÍTULO 4 - CONEXIÓN PHP → MYSQL/Capitulo 4 - Conexion PHP → MYSQL.docx
@@ -18,25 +18,7 @@
           <w:sz w:val="28"/>
           <w:szCs w:val="28"/>
         </w:rPr>
-        <w:t>CAPÍTULO 4</w:t>
-      </w:r>
-      <w:r>
-        <w:rPr>
-          <w:b/>
-          <w:bCs/>
-          <w:sz w:val="28"/>
-          <w:szCs w:val="28"/>
-        </w:rPr>
-        <w:t xml:space="preserve">. </w:t>
-      </w:r>
-      <w:r>
-        <w:rPr>
-          <w:b/>
-          <w:bCs/>
-          <w:sz w:val="28"/>
-          <w:szCs w:val="28"/>
-        </w:rPr>
-        <w:t>CONEXIÓN PHP → MYSQL</w:t>
+        <w:t>CAPÍTULO 4. CONEXIÓN PHP → MYSQL</w:t>
       </w:r>
     </w:p>
     <w:p>
@@ -2084,6 +2066,9 @@
         </w:rPr>
       </w:pPr>
       <w:r>
+        <w:rPr>
+          <w:noProof/>
+        </w:rPr>
         <w:drawing>
           <wp:anchor distT="0" distB="0" distL="114300" distR="114300" simplePos="0" relativeHeight="251659264" behindDoc="1" locked="0" layoutInCell="1" allowOverlap="1" wp14:anchorId="5CE29841" wp14:editId="33B4B458">
             <wp:simplePos x="0" y="0"/>
@@ -2226,12 +2211,13 @@
       <w:r>
         <w:rPr>
           <w:rFonts w:ascii="Arial Black" w:hAnsi="Arial Black"/>
+          <w:noProof/>
           <w:sz w:val="20"/>
           <w:szCs w:val="20"/>
         </w:rPr>
         <w:lastRenderedPageBreak/>
         <w:drawing>
-          <wp:anchor distT="0" distB="0" distL="114300" distR="114300" simplePos="0" relativeHeight="251660288" behindDoc="1" locked="0" layoutInCell="1" allowOverlap="1" wp14:anchorId="6745582A" wp14:editId="48339F47">
+          <wp:anchor distT="0" distB="0" distL="114300" distR="114300" simplePos="0" relativeHeight="251660288" behindDoc="1" locked="0" layoutInCell="1" allowOverlap="1" wp14:anchorId="6745582A" wp14:editId="74D9000D">
             <wp:simplePos x="0" y="0"/>
             <wp:positionH relativeFrom="column">
               <wp:posOffset>-3810</wp:posOffset>
@@ -2239,7 +2225,7 @@
             <wp:positionV relativeFrom="paragraph">
               <wp:posOffset>205105</wp:posOffset>
             </wp:positionV>
-            <wp:extent cx="5612130" cy="1353185"/>
+            <wp:extent cx="5612130" cy="1695450"/>
             <wp:effectExtent l="0" t="0" r="7620" b="0"/>
             <wp:wrapNone/>
             <wp:docPr id="3" name="Imagen 3"/>
@@ -2268,7 +2254,7 @@
                   <pic:spPr>
                     <a:xfrm>
                       <a:off x="0" y="0"/>
-                      <a:ext cx="5612130" cy="1353185"/>
+                      <a:ext cx="5612130" cy="1695450"/>
                     </a:xfrm>
                     <a:prstGeom prst="rect">
                       <a:avLst/>
@@ -2277,6 +2263,9 @@
                 </pic:pic>
               </a:graphicData>
             </a:graphic>
+            <wp14:sizeRelV relativeFrom="margin">
+              <wp14:pctHeight>0</wp14:pctHeight>
+            </wp14:sizeRelV>
           </wp:anchor>
         </w:drawing>
       </w:r>
@@ -2286,32 +2275,38 @@
           <w:sz w:val="20"/>
           <w:szCs w:val="20"/>
         </w:rPr>
-        <w:t xml:space="preserve">Figura 4.3 </w:t>
-      </w:r>
-      <w:r>
+        <w:t>Figura 4.3 Evidencia Ejecución de PHP</w:t>
+      </w:r>
+    </w:p>
+    <w:p>
+      <w:pPr>
+        <w:jc w:val="both"/>
         <w:rPr>
           <w:rFonts w:ascii="Arial Black" w:hAnsi="Arial Black"/>
           <w:sz w:val="20"/>
           <w:szCs w:val="20"/>
         </w:rPr>
-        <w:t>Evidencia</w:t>
-      </w:r>
-      <w:r>
+      </w:pPr>
+    </w:p>
+    <w:p>
+      <w:pPr>
+        <w:jc w:val="both"/>
         <w:rPr>
           <w:rFonts w:ascii="Arial Black" w:hAnsi="Arial Black"/>
           <w:sz w:val="20"/>
           <w:szCs w:val="20"/>
         </w:rPr>
-        <w:t xml:space="preserve"> </w:t>
-      </w:r>
-      <w:r>
+      </w:pPr>
+    </w:p>
+    <w:p>
+      <w:pPr>
+        <w:jc w:val="both"/>
         <w:rPr>
           <w:rFonts w:ascii="Arial Black" w:hAnsi="Arial Black"/>
           <w:sz w:val="20"/>
           <w:szCs w:val="20"/>
         </w:rPr>
-        <w:t>Ejecución de PHP</w:t>
-      </w:r>
+      </w:pPr>
     </w:p>
     <w:p>
       <w:pPr>
@@ -2348,40 +2343,21 @@
         <w:jc w:val="both"/>
         <w:rPr>
           <w:rFonts w:ascii="Arial Black" w:hAnsi="Arial Black"/>
+          <w:b/>
+          <w:bCs/>
           <w:sz w:val="20"/>
           <w:szCs w:val="20"/>
         </w:rPr>
       </w:pPr>
-    </w:p>
-    <w:p>
-      <w:pPr>
-        <w:jc w:val="both"/>
+      <w:r>
         <w:rPr>
           <w:rFonts w:ascii="Arial Black" w:hAnsi="Arial Black"/>
+          <w:noProof/>
           <w:sz w:val="20"/>
           <w:szCs w:val="20"/>
         </w:rPr>
-      </w:pPr>
-    </w:p>
-    <w:p>
-      <w:pPr>
-        <w:jc w:val="both"/>
-        <w:rPr>
-          <w:rFonts w:ascii="Arial Black" w:hAnsi="Arial Black"/>
-          <w:b/>
-          <w:bCs/>
-          <w:sz w:val="20"/>
-          <w:szCs w:val="20"/>
-        </w:rPr>
-      </w:pPr>
-      <w:r>
-        <w:rPr>
-          <w:rFonts w:ascii="Arial Black" w:hAnsi="Arial Black"/>
-          <w:sz w:val="20"/>
-          <w:szCs w:val="20"/>
-        </w:rPr>
         <w:drawing>
-          <wp:anchor distT="0" distB="0" distL="114300" distR="114300" simplePos="0" relativeHeight="251661312" behindDoc="1" locked="0" layoutInCell="1" allowOverlap="1" wp14:anchorId="7A4BA660" wp14:editId="2E6D8AF5">
+          <wp:anchor distT="0" distB="0" distL="114300" distR="114300" simplePos="0" relativeHeight="251661312" behindDoc="1" locked="0" layoutInCell="1" allowOverlap="1" wp14:anchorId="7A4BA660" wp14:editId="0E113A5D">
             <wp:simplePos x="0" y="0"/>
             <wp:positionH relativeFrom="column">
               <wp:posOffset>-3810</wp:posOffset>
@@ -2389,7 +2365,7 @@
             <wp:positionV relativeFrom="paragraph">
               <wp:posOffset>236220</wp:posOffset>
             </wp:positionV>
-            <wp:extent cx="5612130" cy="1371600"/>
+            <wp:extent cx="5612130" cy="1695450"/>
             <wp:effectExtent l="0" t="0" r="7620" b="0"/>
             <wp:wrapNone/>
             <wp:docPr id="4" name="Imagen 4"/>
@@ -2418,7 +2394,7 @@
                   <pic:spPr>
                     <a:xfrm>
                       <a:off x="0" y="0"/>
-                      <a:ext cx="5612130" cy="1371600"/>
+                      <a:ext cx="5612130" cy="1695450"/>
                     </a:xfrm>
                     <a:prstGeom prst="rect">
                       <a:avLst/>
@@ -2526,21 +2502,31 @@
           <w:szCs w:val="20"/>
         </w:rPr>
       </w:pPr>
+    </w:p>
+    <w:p>
+      <w:pPr>
+        <w:jc w:val="both"/>
+        <w:rPr>
+          <w:rFonts w:ascii="Arial Black" w:hAnsi="Arial Black"/>
+          <w:sz w:val="20"/>
+          <w:szCs w:val="20"/>
+        </w:rPr>
+      </w:pPr>
       <w:r>
         <w:rPr>
           <w:noProof/>
         </w:rPr>
         <w:drawing>
-          <wp:anchor distT="0" distB="0" distL="114300" distR="114300" simplePos="0" relativeHeight="251662336" behindDoc="1" locked="0" layoutInCell="1" allowOverlap="1" wp14:anchorId="0A8A5FC7" wp14:editId="6928B077">
+          <wp:anchor distT="0" distB="0" distL="114300" distR="114300" simplePos="0" relativeHeight="251662336" behindDoc="1" locked="0" layoutInCell="1" allowOverlap="1" wp14:anchorId="0A8A5FC7" wp14:editId="7E6ACE64">
             <wp:simplePos x="0" y="0"/>
             <wp:positionH relativeFrom="column">
               <wp:posOffset>-3810</wp:posOffset>
             </wp:positionH>
             <wp:positionV relativeFrom="paragraph">
-              <wp:posOffset>219075</wp:posOffset>
+              <wp:posOffset>219709</wp:posOffset>
             </wp:positionV>
-            <wp:extent cx="5612130" cy="2952750"/>
-            <wp:effectExtent l="0" t="0" r="7620" b="0"/>
+            <wp:extent cx="5612130" cy="3438525"/>
+            <wp:effectExtent l="0" t="0" r="7620" b="9525"/>
             <wp:wrapNone/>
             <wp:docPr id="5" name="Imagen 5"/>
             <wp:cNvGraphicFramePr>
@@ -2567,7 +2553,7 @@
                   <pic:spPr bwMode="auto">
                     <a:xfrm>
                       <a:off x="0" y="0"/>
-                      <a:ext cx="5612130" cy="2952750"/>
+                      <a:ext cx="5612130" cy="3438525"/>
                     </a:xfrm>
                     <a:prstGeom prst="rect">
                       <a:avLst/>
@@ -2584,6 +2570,9 @@
                 </pic:pic>
               </a:graphicData>
             </a:graphic>
+            <wp14:sizeRelV relativeFrom="margin">
+              <wp14:pctHeight>0</wp14:pctHeight>
+            </wp14:sizeRelV>
           </wp:anchor>
         </w:drawing>
       </w:r>
@@ -2593,31 +2582,250 @@
           <w:sz w:val="20"/>
           <w:szCs w:val="20"/>
         </w:rPr>
-        <w:t xml:space="preserve">Figura 4.5 </w:t>
-      </w:r>
-      <w:r>
+        <w:t>Figura 4.5 Evidencia MySQL Workbench</w:t>
+      </w:r>
+    </w:p>
+    <w:p>
+      <w:pPr>
+        <w:jc w:val="both"/>
+      </w:pPr>
+    </w:p>
+    <w:p>
+      <w:pPr>
+        <w:jc w:val="both"/>
+      </w:pPr>
+    </w:p>
+    <w:p/>
+    <w:p/>
+    <w:p/>
+    <w:p/>
+    <w:p/>
+    <w:p/>
+    <w:p/>
+    <w:p/>
+    <w:p/>
+    <w:p/>
+    <w:p/>
+    <w:p>
+      <w:pPr>
         <w:rPr>
           <w:rFonts w:ascii="Arial Black" w:hAnsi="Arial Black"/>
           <w:sz w:val="20"/>
           <w:szCs w:val="20"/>
         </w:rPr>
-        <w:t>Evidencia MySQL Workbench</w:t>
-      </w:r>
-    </w:p>
-    <w:p>
-      <w:pPr>
-        <w:jc w:val="both"/>
-      </w:pPr>
-    </w:p>
-    <w:p>
-      <w:pPr>
-        <w:jc w:val="both"/>
-      </w:pPr>
-    </w:p>
-    <w:p/>
-    <w:p/>
+      </w:pPr>
+      <w:r>
+        <w:rPr>
+          <w:rFonts w:ascii="Arial Black" w:hAnsi="Arial Black"/>
+          <w:sz w:val="20"/>
+          <w:szCs w:val="20"/>
+        </w:rPr>
+        <w:lastRenderedPageBreak/>
+        <w:t xml:space="preserve">Figura 4.6 </w:t>
+      </w:r>
+      <w:r>
+        <w:rPr>
+          <w:rFonts w:ascii="Arial Black" w:hAnsi="Arial Black"/>
+          <w:sz w:val="20"/>
+          <w:szCs w:val="20"/>
+        </w:rPr>
+        <w:t>Evidencia de ejecución del Backend PHP mediante Apache</w:t>
+      </w:r>
+    </w:p>
+    <w:p>
+      <w:pPr>
+        <w:rPr>
+          <w:rFonts w:ascii="Arial Black" w:hAnsi="Arial Black"/>
+          <w:sz w:val="20"/>
+          <w:szCs w:val="20"/>
+        </w:rPr>
+      </w:pPr>
+      <w:r>
+        <w:rPr>
+          <w:rFonts w:ascii="Arial Black" w:hAnsi="Arial Black"/>
+          <w:noProof/>
+          <w:sz w:val="20"/>
+          <w:szCs w:val="20"/>
+        </w:rPr>
+        <w:drawing>
+          <wp:inline distT="0" distB="0" distL="0" distR="0" wp14:anchorId="55C83510" wp14:editId="2E24DAC6">
+            <wp:extent cx="5543550" cy="1724025"/>
+            <wp:effectExtent l="0" t="0" r="0" b="9525"/>
+            <wp:docPr id="6" name="Imagen 6"/>
+            <wp:cNvGraphicFramePr>
+              <a:graphicFrameLocks xmlns:a="http://schemas.openxmlformats.org/drawingml/2006/main" noChangeAspect="1"/>
+            </wp:cNvGraphicFramePr>
+            <a:graphic xmlns:a="http://schemas.openxmlformats.org/drawingml/2006/main">
+              <a:graphicData uri="http://schemas.openxmlformats.org/drawingml/2006/picture">
+                <pic:pic xmlns:pic="http://schemas.openxmlformats.org/drawingml/2006/picture">
+                  <pic:nvPicPr>
+                    <pic:cNvPr id="6" name="Imagen 6"/>
+                    <pic:cNvPicPr/>
+                  </pic:nvPicPr>
+                  <pic:blipFill>
+                    <a:blip r:embed="rId12">
+                      <a:extLst>
+                        <a:ext uri="{28A0092B-C50C-407E-A947-70E740481C1C}">
+                          <a14:useLocalDpi xmlns:a14="http://schemas.microsoft.com/office/drawing/2010/main" val="0"/>
+                        </a:ext>
+                      </a:extLst>
+                    </a:blip>
+                    <a:stretch>
+                      <a:fillRect/>
+                    </a:stretch>
+                  </pic:blipFill>
+                  <pic:spPr>
+                    <a:xfrm>
+                      <a:off x="0" y="0"/>
+                      <a:ext cx="5544328" cy="1724267"/>
+                    </a:xfrm>
+                    <a:prstGeom prst="rect">
+                      <a:avLst/>
+                    </a:prstGeom>
+                  </pic:spPr>
+                </pic:pic>
+              </a:graphicData>
+            </a:graphic>
+          </wp:inline>
+        </w:drawing>
+      </w:r>
+    </w:p>
+    <w:p>
+      <w:pPr>
+        <w:jc w:val="both"/>
+        <w:rPr>
+          <w:rFonts w:cstheme="minorHAnsi"/>
+        </w:rPr>
+      </w:pPr>
+      <w:r>
+        <w:rPr>
+          <w:rFonts w:cstheme="minorHAnsi"/>
+        </w:rPr>
+        <w:t xml:space="preserve">Se verificó el acceso al endpoint inicial de </w:t>
+      </w:r>
+      <w:r>
+        <w:rPr>
+          <w:rFonts w:cstheme="minorHAnsi"/>
+          <w:b/>
+          <w:bCs/>
+        </w:rPr>
+        <w:t>YENJO 1.0</w:t>
+      </w:r>
+      <w:r>
+        <w:rPr>
+          <w:rFonts w:cstheme="minorHAnsi"/>
+        </w:rPr>
+        <w:t xml:space="preserve"> mediante Apache utilizando la ruta </w:t>
+      </w:r>
+      <w:r>
+        <w:rPr>
+          <w:rFonts w:cstheme="minorHAnsi"/>
+          <w:b/>
+          <w:bCs/>
+        </w:rPr>
+        <w:t>http://localhost/YENJO-1.0/backend/api/index.php.</w:t>
+      </w:r>
+      <w:r>
+        <w:rPr>
+          <w:rFonts w:cstheme="minorHAnsi"/>
+        </w:rPr>
+        <w:t xml:space="preserve"> La respuesta obtenida confirma la ejecución correcta del archivo PHP y la disponibilidad inicial de la API REST, mostrando el mensaje: </w:t>
+      </w:r>
+      <w:r>
+        <w:rPr>
+          <w:rFonts w:cstheme="minorHAnsi"/>
+          <w:b/>
+          <w:bCs/>
+        </w:rPr>
+        <w:t>“API REST de YENJO 1.0 funcionando correctamente”</w:t>
+      </w:r>
+      <w:r>
+        <w:rPr>
+          <w:rFonts w:cstheme="minorHAnsi"/>
+        </w:rPr>
+        <w:t>.</w:t>
+      </w:r>
+    </w:p>
+    <w:p>
+      <w:pPr>
+        <w:jc w:val="both"/>
+        <w:rPr>
+          <w:rFonts w:cstheme="minorHAnsi"/>
+          <w:sz w:val="28"/>
+          <w:szCs w:val="28"/>
+        </w:rPr>
+      </w:pPr>
+      <w:r>
+        <w:rPr>
+          <w:rFonts w:cstheme="minorHAnsi"/>
+          <w:b/>
+          <w:bCs/>
+          <w:sz w:val="28"/>
+          <w:szCs w:val="28"/>
+        </w:rPr>
+        <w:t>4.12 Conclusión</w:t>
+      </w:r>
+    </w:p>
+    <w:p>
+      <w:pPr>
+        <w:jc w:val="both"/>
+        <w:rPr>
+          <w:rFonts w:cstheme="minorHAnsi"/>
+        </w:rPr>
+      </w:pPr>
+      <w:r>
+        <w:rPr>
+          <w:rFonts w:cstheme="minorHAnsi"/>
+        </w:rPr>
+        <w:t xml:space="preserve">La implementación de la conexión </w:t>
+      </w:r>
+      <w:r>
+        <w:rPr>
+          <w:rFonts w:cstheme="minorHAnsi"/>
+          <w:b/>
+          <w:bCs/>
+        </w:rPr>
+        <w:t>PHP → MySQL</w:t>
+      </w:r>
+      <w:r>
+        <w:rPr>
+          <w:rFonts w:cstheme="minorHAnsi"/>
+        </w:rPr>
+        <w:t xml:space="preserve"> permitió establecer y verificar la comunicación entre el Backend de </w:t>
+      </w:r>
+      <w:r>
+        <w:rPr>
+          <w:rFonts w:cstheme="minorHAnsi"/>
+          <w:b/>
+          <w:bCs/>
+        </w:rPr>
+        <w:t>YENJO 1.0</w:t>
+      </w:r>
+      <w:r>
+        <w:rPr>
+          <w:rFonts w:cstheme="minorHAnsi"/>
+        </w:rPr>
+        <w:t xml:space="preserve"> y la base de datos yenjo_1_0, utilizando PDO como mecanismo de conexión y centralizando la configuración en el archivo database.php. Durante las pruebas se verificó la disponibilidad del servicio MySQL mediante el puerto 3306, el manejo de excepciones y la ejecución correcta de la prueba de conexión desde PHP. Adicionalmente, se comprobó mediante Apache el acceso y ejecución del Backend desde la ubicación real del proyecto, obteniendo una respuesta correcta del endpoint inicial de la API REST. Con estos resultados, la infraestructura de comunicación del Backend queda preparada para continuar con la implementación de la API REST de </w:t>
+      </w:r>
+      <w:r>
+        <w:rPr>
+          <w:rFonts w:cstheme="minorHAnsi"/>
+          <w:b/>
+          <w:bCs/>
+        </w:rPr>
+        <w:t>YENJO 1.0.</w:t>
+      </w:r>
+    </w:p>
+    <w:p>
+      <w:pPr>
+        <w:jc w:val="both"/>
+        <w:rPr>
+          <w:rFonts w:cstheme="minorHAnsi"/>
+        </w:rPr>
+      </w:pPr>
+    </w:p>
     <w:sectPr>
-      <w:footerReference w:type="default" r:id="rId12"/>
+      <w:footerReference w:type="default" r:id="rId13"/>
       <w:pgSz w:w="12240" w:h="15840"/>
       <w:pgMar w:top="1417" w:right="1701" w:bottom="1417" w:left="1701" w:header="708" w:footer="708" w:gutter="0"/>
       <w:cols w:space="708"/>
@@ -2662,6 +2870,7 @@
         <w:docPartUnique/>
       </w:docPartObj>
     </w:sdtPr>
+    <w:sdtEndPr/>
     <w:sdtContent>
       <w:p>
         <w:pPr>
@@ -2745,7 +2954,7 @@
         <v:path o:extrusionok="f" gradientshapeok="t" o:connecttype="rect"/>
         <o:lock v:ext="edit" aspectratio="t"/>
       </v:shapetype>
-      <v:shape id="_x0000_i1139" type="#_x0000_t75" style="width:11.25pt;height:11.25pt" o:bullet="t">
+      <v:shape id="_x0000_i1088" type="#_x0000_t75" style="width:11.25pt;height:11.25pt" o:bullet="t">
         <v:imagedata r:id="rId1" o:title="mso3009"/>
       </v:shape>
     </w:pict>

</xml_diff>